<commit_message>
Add new script to check regected list
</commit_message>
<xml_diff>
--- a/routeros/mesh-scripts-instruction.docx
+++ b/routeros/mesh-scripts-instruction.docx
@@ -510,6 +510,94 @@
           </w:p>
         </w:tc>
       </w:tr>
+      <w:tr>
+        <w:trPr>
+          <w:tblHeader w:val="off"/>
+        </w:trPr>
+        <w:tc>
+          <w:tcPr>
+            <w:tcW w:type="dxa" w:w="2750"/>
+            <w:tcBorders>
+              <w:top w:val="single" w:color="BBBBBB" w:sz="4"/>
+              <w:left w:val="single" w:color="BBBBBB" w:sz="4"/>
+              <w:bottom w:val="single" w:color="BBBBBB" w:sz="4"/>
+              <w:right w:val="single" w:color="BBBBBB" w:sz="4"/>
+            </w:tcBorders>
+            <w:tcMar>
+              <w:top w:type="dxa" w:w="35"/>
+              <w:left w:type="dxa" w:w="90"/>
+              <w:bottom w:type="dxa" w:w="35"/>
+              <w:right w:type="dxa" w:w="90"/>
+            </w:tcMar>
+          </w:tcPr>
+          <w:p>
+            <w:r>
+              <w:rPr>
+                <w:rFonts w:ascii="Consolas" w:cs="Consolas" w:eastAsia="Consolas" w:hAnsi="Consolas"/>
+                <w:sz w:val="18"/>
+                <w:szCs w:val="18"/>
+              </w:rPr>
+              <w:t xml:space="preserve">mesh-rejected.rsc</w:t>
+            </w:r>
+          </w:p>
+        </w:tc>
+        <w:tc>
+          <w:tcPr>
+            <w:tcW w:type="dxa" w:w="1900"/>
+            <w:tcBorders>
+              <w:top w:val="single" w:color="BBBBBB" w:sz="4"/>
+              <w:left w:val="single" w:color="BBBBBB" w:sz="4"/>
+              <w:bottom w:val="single" w:color="BBBBBB" w:sz="4"/>
+              <w:right w:val="single" w:color="BBBBBB" w:sz="4"/>
+            </w:tcBorders>
+            <w:tcMar>
+              <w:top w:type="dxa" w:w="35"/>
+              <w:left w:type="dxa" w:w="90"/>
+              <w:bottom w:type="dxa" w:w="35"/>
+              <w:right w:type="dxa" w:w="90"/>
+            </w:tcMar>
+          </w:tcPr>
+          <w:p>
+            <w:r>
+              <w:rPr>
+                <w:rFonts w:ascii="Consolas" w:cs="Consolas" w:eastAsia="Consolas" w:hAnsi="Consolas"/>
+                <w:sz w:val="18"/>
+                <w:szCs w:val="18"/>
+              </w:rPr>
+              <w:t xml:space="preserve">$meshRejected</w:t>
+            </w:r>
+          </w:p>
+        </w:tc>
+        <w:tc>
+          <w:tcPr>
+            <w:tcW w:type="dxa" w:w="4700"/>
+            <w:tcBorders>
+              <w:top w:val="single" w:color="BBBBBB" w:sz="4"/>
+              <w:left w:val="single" w:color="BBBBBB" w:sz="4"/>
+              <w:bottom w:val="single" w:color="BBBBBB" w:sz="4"/>
+              <w:right w:val="single" w:color="BBBBBB" w:sz="4"/>
+            </w:tcBorders>
+            <w:tcMar>
+              <w:top w:type="dxa" w:w="35"/>
+              <w:left w:type="dxa" w:w="90"/>
+              <w:bottom w:type="dxa" w:w="35"/>
+              <w:right w:type="dxa" w:w="90"/>
+            </w:tcMar>
+          </w:tcPr>
+          <w:p>
+            <w:r>
+              <w:rPr>
+                <w:rFonts w:ascii="Arial" w:cs="Arial" w:eastAsia="Arial" w:hAnsi="Arial"/>
+                <w:b w:val="false"/>
+                <w:bCs w:val="false"/>
+                <w:sz w:val="19"/>
+                <w:szCs w:val="19"/>
+              </w:rPr>
+              <w:t xml:space="preserve">Хто був відключений правилом доступу (за логом): час, точка, сигнал.</w:t>
+            </w:r>
+          </w:p>
+        </w:tc>
+      </w:tr>
     </w:tbl>
     <w:p>
       <w:pPr>
@@ -677,7 +765,7 @@
     <w:p>
       <w:pPr>
         <w:shd w:fill="F2F2F2" w:val="clear"/>
-        <w:spacing w:after="90"/>
+        <w:spacing w:after="0"/>
         <w:ind w:left="100" w:right="100"/>
       </w:pPr>
       <w:r>
@@ -687,6 +775,21 @@
           <w:szCs w:val="18"/>
         </w:rPr>
         <w:t xml:space="preserve">$meshLive interval=3 top=15 source=ax3-1</w:t>
+      </w:r>
+    </w:p>
+    <w:p>
+      <w:pPr>
+        <w:shd w:fill="F2F2F2" w:val="clear"/>
+        <w:spacing w:after="90"/>
+        <w:ind w:left="100" w:right="100"/>
+      </w:pPr>
+      <w:r>
+        <w:rPr>
+          <w:rFonts w:ascii="Consolas" w:cs="Consolas" w:eastAsia="Consolas" w:hAnsi="Consolas"/>
+          <w:sz w:val="18"/>
+          <w:szCs w:val="18"/>
+        </w:rPr>
+        <w:t xml:space="preserve">$meshRejected last=20</w:t>
       </w:r>
     </w:p>
     <w:tbl>
@@ -1071,6 +1174,67 @@
                 <w:szCs w:val="19"/>
               </w:rPr>
               <w:t xml:space="preserve">Для $meshLive: пауза між оновленнями в секундах і скільки пристроїв показувати.</w:t>
+            </w:r>
+          </w:p>
+        </w:tc>
+      </w:tr>
+      <w:tr>
+        <w:trPr>
+          <w:tblHeader w:val="off"/>
+        </w:trPr>
+        <w:tc>
+          <w:tcPr>
+            <w:tcW w:type="dxa" w:w="1700"/>
+            <w:tcBorders>
+              <w:top w:val="single" w:color="BBBBBB" w:sz="4"/>
+              <w:left w:val="single" w:color="BBBBBB" w:sz="4"/>
+              <w:bottom w:val="single" w:color="BBBBBB" w:sz="4"/>
+              <w:right w:val="single" w:color="BBBBBB" w:sz="4"/>
+            </w:tcBorders>
+            <w:tcMar>
+              <w:top w:type="dxa" w:w="35"/>
+              <w:left w:type="dxa" w:w="90"/>
+              <w:bottom w:type="dxa" w:w="35"/>
+              <w:right w:type="dxa" w:w="90"/>
+            </w:tcMar>
+          </w:tcPr>
+          <w:p>
+            <w:r>
+              <w:rPr>
+                <w:rFonts w:ascii="Consolas" w:cs="Consolas" w:eastAsia="Consolas" w:hAnsi="Consolas"/>
+                <w:sz w:val="18"/>
+                <w:szCs w:val="18"/>
+              </w:rPr>
+              <w:t xml:space="preserve">last</w:t>
+            </w:r>
+          </w:p>
+        </w:tc>
+        <w:tc>
+          <w:tcPr>
+            <w:tcW w:type="dxa" w:w="7650"/>
+            <w:tcBorders>
+              <w:top w:val="single" w:color="BBBBBB" w:sz="4"/>
+              <w:left w:val="single" w:color="BBBBBB" w:sz="4"/>
+              <w:bottom w:val="single" w:color="BBBBBB" w:sz="4"/>
+              <w:right w:val="single" w:color="BBBBBB" w:sz="4"/>
+            </w:tcBorders>
+            <w:tcMar>
+              <w:top w:type="dxa" w:w="35"/>
+              <w:left w:type="dxa" w:w="90"/>
+              <w:bottom w:type="dxa" w:w="35"/>
+              <w:right w:type="dxa" w:w="90"/>
+            </w:tcMar>
+          </w:tcPr>
+          <w:p>
+            <w:r>
+              <w:rPr>
+                <w:rFonts w:ascii="Arial" w:cs="Arial" w:eastAsia="Arial" w:hAnsi="Arial"/>
+                <w:b w:val="false"/>
+                <w:bCs w:val="false"/>
+                <w:sz w:val="19"/>
+                <w:szCs w:val="19"/>
+              </w:rPr>
+              <w:t xml:space="preserve">Для $meshRejected: скільки останніх подій показати (за замовчуванням 50). Лог роутера короткий і скидається при перезавантаженні.</w:t>
             </w:r>
           </w:p>
         </w:tc>
@@ -1755,6 +1919,93 @@
           <w:szCs w:val="19"/>
         </w:rPr>
         <w:t xml:space="preserve">: вивантаження з пристрою.</w:t>
+      </w:r>
+    </w:p>
+    <w:p>
+      <w:pPr>
+        <w:pStyle w:val="Heading1"/>
+        <w:spacing w:after="70" w:before="160"/>
+      </w:pPr>
+      <w:r>
+        <w:rPr>
+          <w:rFonts w:ascii="Arial" w:cs="Arial" w:eastAsia="Arial" w:hAnsi="Arial"/>
+          <w:b/>
+          <w:bCs/>
+          <w:sz w:val="24"/>
+          <w:szCs w:val="24"/>
+        </w:rPr>
+        <w:t xml:space="preserve">4. Обмеження слабкого сигналу</w:t>
+      </w:r>
+    </w:p>
+    <w:p>
+      <w:pPr>
+        <w:spacing w:after="80"/>
+      </w:pPr>
+      <w:r>
+        <w:rPr>
+          <w:rFonts w:ascii="Arial" w:cs="Arial" w:eastAsia="Arial" w:hAnsi="Arial"/>
+          <w:sz w:val="19"/>
+          <w:szCs w:val="19"/>
+        </w:rPr>
+        <w:t xml:space="preserve">Правило відхиляє пристрої із сигналом слабшим за встановлений поріг, щоб вони шукали ближчу точку. Це не скрипт, а звичайні команди, вони діють одразу, без перезавантаження:</w:t>
+      </w:r>
+    </w:p>
+    <w:p>
+      <w:pPr>
+        <w:shd w:fill="F2F2F2" w:val="clear"/>
+        <w:spacing w:after="0"/>
+        <w:ind w:left="100" w:right="100"/>
+      </w:pPr>
+      <w:r>
+        <w:rPr>
+          <w:rFonts w:ascii="Consolas" w:cs="Consolas" w:eastAsia="Consolas" w:hAnsi="Consolas"/>
+          <w:sz w:val="18"/>
+          <w:szCs w:val="18"/>
+        </w:rPr>
+        <w:t xml:space="preserve">/interface wifi access-list disable [find comment="min-signal"]    (вимкнути)</w:t>
+      </w:r>
+    </w:p>
+    <w:p>
+      <w:pPr>
+        <w:shd w:fill="F2F2F2" w:val="clear"/>
+        <w:spacing w:after="0"/>
+        <w:ind w:left="100" w:right="100"/>
+      </w:pPr>
+      <w:r>
+        <w:rPr>
+          <w:rFonts w:ascii="Consolas" w:cs="Consolas" w:eastAsia="Consolas" w:hAnsi="Consolas"/>
+          <w:sz w:val="18"/>
+          <w:szCs w:val="18"/>
+        </w:rPr>
+        <w:t xml:space="preserve">/interface wifi access-list enable [find comment="min-signal"]     (увімкнути)</w:t>
+      </w:r>
+    </w:p>
+    <w:p>
+      <w:pPr>
+        <w:shd w:fill="F2F2F2" w:val="clear"/>
+        <w:spacing w:after="90"/>
+        <w:ind w:left="100" w:right="100"/>
+      </w:pPr>
+      <w:r>
+        <w:rPr>
+          <w:rFonts w:ascii="Consolas" w:cs="Consolas" w:eastAsia="Consolas" w:hAnsi="Consolas"/>
+          <w:sz w:val="18"/>
+          <w:szCs w:val="18"/>
+        </w:rPr>
+        <w:t xml:space="preserve">/interface wifi access-list print                                  (перевірити стан)</w:t>
+      </w:r>
+    </w:p>
+    <w:p>
+      <w:pPr>
+        <w:spacing w:after="80"/>
+      </w:pPr>
+      <w:r>
+        <w:rPr>
+          <w:rFonts w:ascii="Arial" w:cs="Arial" w:eastAsia="Arial" w:hAnsi="Arial"/>
+          <w:sz w:val="19"/>
+          <w:szCs w:val="19"/>
+        </w:rPr>
+        <w:t xml:space="preserve">У результаті print правило з позначкою X вимкнене. Без X воно працює.</w:t>
       </w:r>
     </w:p>
     <w:sectPr>

</xml_diff>